<commit_message>
Auto sync 2026-09-10 11:04:21
</commit_message>
<xml_diff>
--- a/04-需求管理/PRD-OMS订单履约时效管理-v1.0.docx
+++ b/04-需求管理/PRD-OMS订单履约时效管理-v1.0.docx
@@ -18,6 +18,14 @@
     </w:p>
     <w:p>
       <w:pPr>
+        <w:pBdr>
+          <w:top w:val="nil"/>
+          <w:left w:val="nil"/>
+          <w:bottom w:val="nil"/>
+          <w:right w:val="nil"/>
+          <w:between w:val="nil"/>
+          <w:bar w:val="nil"/>
+        </w:pBdr>
         <w:pStyle w:val="Title"/>
         <w:spacing w:after="100"/>
       </w:pPr>
@@ -51,7 +59,8 @@
       <w:r>
         <w:rPr>
           <w:rFonts w:ascii="Microsoft YaHei" w:hAnsi="Microsoft YaHei" w:eastAsia="Microsoft YaHei"/>
-          <w:color w:val="243447"/>
+          <w:b/>
+          <w:color w:val="667085"/>
           <w:sz w:val="20"/>
           <w:b/>
         </w:rPr>
@@ -73,7 +82,8 @@
       <w:r>
         <w:rPr>
           <w:rFonts w:ascii="Microsoft YaHei" w:hAnsi="Microsoft YaHei" w:eastAsia="Microsoft YaHei"/>
-          <w:color w:val="243447"/>
+          <w:b/>
+          <w:color w:val="667085"/>
           <w:sz w:val="20"/>
           <w:b/>
         </w:rPr>
@@ -95,7 +105,8 @@
       <w:r>
         <w:rPr>
           <w:rFonts w:ascii="Microsoft YaHei" w:hAnsi="Microsoft YaHei" w:eastAsia="Microsoft YaHei"/>
-          <w:color w:val="243447"/>
+          <w:b/>
+          <w:color w:val="667085"/>
           <w:sz w:val="20"/>
           <w:b/>
         </w:rPr>
@@ -117,7 +128,8 @@
       <w:r>
         <w:rPr>
           <w:rFonts w:ascii="Microsoft YaHei" w:hAnsi="Microsoft YaHei" w:eastAsia="Microsoft YaHei"/>
-          <w:color w:val="243447"/>
+          <w:b/>
+          <w:color w:val="667085"/>
           <w:sz w:val="20"/>
           <w:b/>
         </w:rPr>
@@ -139,7 +151,8 @@
       <w:r>
         <w:rPr>
           <w:rFonts w:ascii="Microsoft YaHei" w:hAnsi="Microsoft YaHei" w:eastAsia="Microsoft YaHei"/>
-          <w:color w:val="243447"/>
+          <w:b/>
+          <w:color w:val="667085"/>
           <w:sz w:val="20"/>
           <w:b/>
         </w:rPr>
@@ -161,7 +174,8 @@
       <w:r>
         <w:rPr>
           <w:rFonts w:ascii="Microsoft YaHei" w:hAnsi="Microsoft YaHei" w:eastAsia="Microsoft YaHei"/>
-          <w:color w:val="243447"/>
+          <w:b/>
+          <w:color w:val="667085"/>
           <w:sz w:val="20"/>
           <w:b/>
         </w:rPr>
@@ -183,7 +197,8 @@
       <w:r>
         <w:rPr>
           <w:rFonts w:ascii="Microsoft YaHei" w:hAnsi="Microsoft YaHei" w:eastAsia="Microsoft YaHei"/>
-          <w:color w:val="243447"/>
+          <w:b/>
+          <w:color w:val="667085"/>
           <w:sz w:val="20"/>
           <w:b/>
         </w:rPr>
@@ -347,6 +362,7 @@
       <w:r>
         <w:rPr>
           <w:rFonts w:ascii="Microsoft YaHei" w:hAnsi="Microsoft YaHei" w:eastAsia="Microsoft YaHei"/>
+          <w:b/>
           <w:color w:val="243447"/>
           <w:sz w:val="20"/>
           <w:b/>
@@ -371,6 +387,7 @@
       <w:r>
         <w:rPr>
           <w:rFonts w:ascii="Microsoft YaHei" w:hAnsi="Microsoft YaHei" w:eastAsia="Microsoft YaHei"/>
+          <w:b/>
           <w:color w:val="243447"/>
           <w:sz w:val="20"/>
           <w:b/>
@@ -395,6 +412,7 @@
       <w:r>
         <w:rPr>
           <w:rFonts w:ascii="Microsoft YaHei" w:hAnsi="Microsoft YaHei" w:eastAsia="Microsoft YaHei"/>
+          <w:b/>
           <w:color w:val="243447"/>
           <w:sz w:val="20"/>
           <w:b/>
@@ -419,6 +437,7 @@
       <w:r>
         <w:rPr>
           <w:rFonts w:ascii="Microsoft YaHei" w:hAnsi="Microsoft YaHei" w:eastAsia="Microsoft YaHei"/>
+          <w:b/>
           <w:color w:val="243447"/>
           <w:sz w:val="20"/>
           <w:b/>
@@ -443,6 +462,7 @@
       <w:r>
         <w:rPr>
           <w:rFonts w:ascii="Microsoft YaHei" w:hAnsi="Microsoft YaHei" w:eastAsia="Microsoft YaHei"/>
+          <w:b/>
           <w:color w:val="243447"/>
           <w:sz w:val="20"/>
           <w:b/>
@@ -467,6 +487,7 @@
       <w:r>
         <w:rPr>
           <w:rFonts w:ascii="Microsoft YaHei" w:hAnsi="Microsoft YaHei" w:eastAsia="Microsoft YaHei"/>
+          <w:b/>
           <w:color w:val="243447"/>
           <w:sz w:val="20"/>
           <w:b/>
@@ -17269,7 +17290,7 @@
           <w:color w:val="243447"/>
           <w:sz w:val="21"/>
         </w:rPr>
-        <w:t xml:space="preserve">下列问题影响正式统计和流程，应由业务负责人会同相关系统负责人确认，不能由研发按界面表现自行推定。</w:t>
+        <w:t xml:space="preserve">以下事项由业务负责人会同相关系统负责人确认，未定版前不作为生产规则。</w:t>
       </w:r>
     </w:p>
     <w:tbl>
@@ -18102,7 +18123,7 @@
                 <w:color w:val="243447"/>
                 <w:sz w:val="20"/>
               </w:rPr>
-              <w:t xml:space="preserve">本期按六节点时效管理建设履约总览及独立配置能力，保留普通客户和系统客户两套适用规则。评审先明确上述业务决策，再确认接口、优先级和验收范围；未确认事项不作为已批准规则。正式上线以真实事件、规则快照、统计正确性及实际通知链路为准。</w:t>
+              <w:t xml:space="preserve">建议按本PRD建设六节点履约总览和独立配置。先确认D01至D08，再定接口、优先级与验收范围；正式上线以真实事件、规则快照和通知链路验证为准。</w:t>
             </w:r>
           </w:p>
         </w:tc>

</xml_diff>

<commit_message>
Auto sync 2026-09-10 11:06:45
</commit_message>
<xml_diff>
--- a/04-需求管理/PRD-OMS订单履约时效管理-v1.0.docx
+++ b/04-需求管理/PRD-OMS订单履约时效管理-v1.0.docx
@@ -18129,6 +18129,14 @@
         </w:tc>
       </w:tr>
     </w:tbl>
+    <w:p>
+      <w:pPr>
+        <w:spacing w:before="0" w:after="0" w:line="20" w:lineRule="exact"/>
+        <w:rPr>
+          <w:sz w:val="2"/>
+        </w:rPr>
+      </w:pPr>
+    </w:p>
     <w:sectPr>
       <w:headerReference w:type="default" r:id="rId9"/>
       <w:footerReference w:type="default" r:id="rId10"/>

</xml_diff>